<commit_message>
add my new skills
</commit_message>
<xml_diff>
--- a/dist/resumes.mileinyvaldez.docx
+++ b/dist/resumes.mileinyvaldez.docx
@@ -1,6 +1,6 @@
 
 <file path=word/document.xml><?xml version="1.0" encoding="utf-8"?>
-<w:document xmlns:wpc="http://schemas.microsoft.com/office/word/2010/wordprocessingCanvas" xmlns:cx="http://schemas.microsoft.com/office/drawing/2014/chartex" xmlns:cx1="http://schemas.microsoft.com/office/drawing/2015/9/8/chartex" xmlns:cx2="http://schemas.microsoft.com/office/drawing/2015/10/21/chartex" xmlns:cx3="http://schemas.microsoft.com/office/drawing/2016/5/9/chartex" xmlns:cx4="http://schemas.microsoft.com/office/drawing/2016/5/10/chartex" xmlns:cx5="http://schemas.microsoft.com/office/drawing/2016/5/11/chartex" xmlns:cx6="http://schemas.microsoft.com/office/drawing/2016/5/12/chartex" xmlns:cx7="http://schemas.microsoft.com/office/drawing/2016/5/13/chartex" xmlns:cx8="http://schemas.microsoft.com/office/drawing/2016/5/14/chartex" xmlns:mc="http://schemas.openxmlformats.org/markup-compatibility/2006" xmlns:aink="http://schemas.microsoft.com/office/drawing/2016/ink" xmlns:am3d="http://schemas.microsoft.com/office/drawing/2017/model3d" xmlns:o="urn:schemas-microsoft-com:office:office" xmlns:oel="http://schemas.microsoft.com/office/2019/extlst" xmlns:r="http://schemas.openxmlformats.org/officeDocument/2006/relationships" xmlns:m="http://schemas.openxmlformats.org/officeDocument/2006/math" xmlns:v="urn:schemas-microsoft-com:vml" xmlns:wp14="http://schemas.microsoft.com/office/word/2010/wordprocessingDrawing" xmlns:wp="http://schemas.openxmlformats.org/drawingml/2006/wordprocessingDrawing" xmlns:w10="urn:schemas-microsoft-com:office:word" xmlns:w="http://schemas.openxmlformats.org/wordprocessingml/2006/main" xmlns:w14="http://schemas.microsoft.com/office/word/2010/wordml" xmlns:w15="http://schemas.microsoft.com/office/word/2012/wordml" xmlns:w16cex="http://schemas.microsoft.com/office/word/2018/wordml/cex" xmlns:w16cid="http://schemas.microsoft.com/office/word/2016/wordml/cid" xmlns:w16="http://schemas.microsoft.com/office/word/2018/wordml" xmlns:w16du="http://schemas.microsoft.com/office/word/2023/wordml/word16du" xmlns:w16sdtdh="http://schemas.microsoft.com/office/word/2020/wordml/sdtdatahash" xmlns:w16sdtfl="http://schemas.microsoft.com/office/word/2024/wordml/sdtformatlock" xmlns:w16se="http://schemas.microsoft.com/office/word/2015/wordml/symex" xmlns:wpg="http://schemas.microsoft.com/office/word/2010/wordprocessingGroup" xmlns:wpi="http://schemas.microsoft.com/office/word/2010/wordprocessingInk" xmlns:wne="http://schemas.microsoft.com/office/word/2006/wordml" xmlns:wps="http://schemas.microsoft.com/office/word/2010/wordprocessingShape" mc:Ignorable="w14 w15 w16se w16cid w16 w16cex w16sdtdh w16sdtfl w16du wp14">
+<w:document xmlns:wpc="http://schemas.microsoft.com/office/word/2010/wordprocessingCanvas" xmlns:cx="http://schemas.microsoft.com/office/drawing/2014/chartex" xmlns:cx1="http://schemas.microsoft.com/office/drawing/2015/9/8/chartex" xmlns:cx2="http://schemas.microsoft.com/office/drawing/2015/10/21/chartex" xmlns:cx3="http://schemas.microsoft.com/office/drawing/2016/5/9/chartex" xmlns:cx4="http://schemas.microsoft.com/office/drawing/2016/5/10/chartex" xmlns:cx5="http://schemas.microsoft.com/office/drawing/2016/5/11/chartex" xmlns:cx6="http://schemas.microsoft.com/office/drawing/2016/5/12/chartex" xmlns:cx7="http://schemas.microsoft.com/office/drawing/2016/5/13/chartex" xmlns:cx8="http://schemas.microsoft.com/office/drawing/2016/5/14/chartex" xmlns:mc="http://schemas.openxmlformats.org/markup-compatibility/2006" xmlns:m="http://schemas.openxmlformats.org/officeDocument/2006/math" xmlns:aink="http://schemas.microsoft.com/office/drawing/2016/ink" xmlns:am3d="http://schemas.microsoft.com/office/drawing/2017/model3d" xmlns:oel="http://schemas.microsoft.com/office/2019/extlst" xmlns:r="http://schemas.openxmlformats.org/officeDocument/2006/relationships" xmlns:wp14="http://schemas.microsoft.com/office/word/2010/wordprocessingDrawing" xmlns:wp="http://schemas.openxmlformats.org/drawingml/2006/wordprocessingDrawing" xmlns:wpg="http://schemas.microsoft.com/office/word/2010/wordprocessingGroup" xmlns:wpi="http://schemas.microsoft.com/office/word/2010/wordprocessingInk" xmlns:wps="http://schemas.microsoft.com/office/word/2010/wordprocessingShape" xmlns:o="urn:schemas-microsoft-com:office:office" xmlns:v="urn:schemas-microsoft-com:vml" xmlns:w10="urn:schemas-microsoft-com:office:word" xmlns:w="http://schemas.openxmlformats.org/wordprocessingml/2006/main" xmlns:w14="http://schemas.microsoft.com/office/word/2010/wordml" xmlns:w15="http://schemas.microsoft.com/office/word/2012/wordml" xmlns:w16cex="http://schemas.microsoft.com/office/word/2018/wordml/cex" xmlns:w16cid="http://schemas.microsoft.com/office/word/2016/wordml/cid" xmlns:w16="http://schemas.microsoft.com/office/word/2018/wordml" xmlns:w16sdtdh="http://schemas.microsoft.com/office/word/2020/wordml/sdtdatahash" xmlns:w16sdtfl="http://schemas.microsoft.com/office/word/2024/wordml/sdtformatlock" xmlns:w16se="http://schemas.microsoft.com/office/word/2015/wordml/symex" xmlns:w16du="http://schemas.microsoft.com/office/word/2023/wordml/word16du" xmlns:wne="http://schemas.microsoft.com/office/word/2006/wordml" mc:Ignorable="w14 w15 w16se w16cid w16 w16cex w16sdtdh w16sdtfl w16du wp14">
   <w:body>
     <w:p>
       <w:pPr>
@@ -81,17 +81,39 @@
         </w:rPr>
         <w:t xml:space="preserve"> </w:t>
       </w:r>
-      <w:hyperlink r:id="rId6" w:history="1">
-        <w:r>
+      <w:r>
+        <w:rPr>
+          <w:rFonts w:ascii="Times New Roman" w:eastAsia="Times New Roman" w:hAnsi="Times New Roman" w:cs="Times New Roman"/>
+          <w:color w:val="000000" w:themeColor="text1"/>
+          <w:sz w:val="28"/>
+          <w:szCs w:val="28"/>
+        </w:rPr>
+        <w:t xml:space="preserve">mileinygreys_402@hotmail.com </w:t>
+      </w:r>
+      <w:sdt>
+        <w:sdtPr>
           <w:rPr>
-            <w:rStyle w:val="Hyperlink"/>
-            <w:rFonts w:ascii="Times New Roman" w:eastAsia="Times New Roman" w:hAnsi="Times New Roman" w:cs="Times New Roman"/>
+            <w:rFonts w:ascii="Times New Roman" w:hAnsi="Times New Roman" w:cs="Times New Roman"/>
+            <w:color w:val="000000" w:themeColor="text1"/>
             <w:sz w:val="28"/>
             <w:szCs w:val="28"/>
           </w:rPr>
-          <w:t>mileinygreys_402@hotmail.com</w:t>
-        </w:r>
-      </w:hyperlink>
+          <w:tag w:val="goog_rdk_3"/>
+          <w:id w:val="-543059390"/>
+        </w:sdtPr>
+        <w:sdtContent>
+          <w:r>
+            <w:rPr>
+              <w:rFonts w:ascii="Times New Roman" w:eastAsia="Arial Unicode MS" w:hAnsi="Times New Roman" w:cs="Times New Roman"/>
+              <w:color w:val="000000" w:themeColor="text1"/>
+              <w:sz w:val="28"/>
+              <w:szCs w:val="28"/>
+              <w:highlight w:val="white"/>
+            </w:rPr>
+            <w:t xml:space="preserve">♦ </w:t>
+          </w:r>
+        </w:sdtContent>
+      </w:sdt>
       <w:r>
         <w:rPr>
           <w:rFonts w:ascii="Times New Roman" w:eastAsia="Times New Roman" w:hAnsi="Times New Roman" w:cs="Times New Roman"/>
@@ -99,16 +121,7 @@
           <w:sz w:val="28"/>
           <w:szCs w:val="28"/>
         </w:rPr>
-        <w:t xml:space="preserve"> </w:t>
-      </w:r>
-      <w:r>
-        <w:rPr>
-          <w:rFonts w:ascii="Times New Roman" w:eastAsia="Times New Roman" w:hAnsi="Times New Roman" w:cs="Times New Roman"/>
-          <w:color w:val="000000" w:themeColor="text1"/>
-          <w:sz w:val="28"/>
-          <w:szCs w:val="28"/>
-        </w:rPr>
-        <w:t xml:space="preserve">Bronx, New York </w:t>
+        <w:t xml:space="preserve"> Bronx, New York </w:t>
       </w:r>
       <w:sdt>
         <w:sdtPr>
@@ -141,7 +154,7 @@
             </w:rPr>
             <w:t xml:space="preserve">Portfolio: </w:t>
           </w:r>
-          <w:hyperlink r:id="rId7" w:history="1">
+          <w:hyperlink r:id="rId6" w:history="1">
             <w:r>
               <w:rPr>
                 <w:rStyle w:val="Hyperlink"/>
@@ -149,20 +162,18 @@
                 <w:color w:val="0969DA"/>
                 <w:sz w:val="21"/>
                 <w:szCs w:val="21"/>
-                <w:shd w:val="clear" w:color="auto" w:fill="FFFFFF"/>
               </w:rPr>
               <w:t>https://mileiny-portfolio-valdez.vercel.app/</w:t>
             </w:r>
           </w:hyperlink>
           <w:r>
             <w:rPr>
-              <w:rFonts w:ascii="Times New Roman" w:eastAsia="Arial Unicode MS" w:hAnsi="Times New Roman" w:cs="Times New Roman"/>
-              <w:color w:val="000000" w:themeColor="text1"/>
-              <w:sz w:val="28"/>
-              <w:szCs w:val="28"/>
-              <w:highlight w:val="white"/>
+              <w:rFonts w:ascii="Segoe UI" w:hAnsi="Segoe UI" w:cs="Segoe UI"/>
+              <w:color w:val="1F2328"/>
+              <w:sz w:val="21"/>
+              <w:szCs w:val="21"/>
             </w:rPr>
-            <w:t xml:space="preserve"> </w:t>
+            <w:t xml:space="preserve">  </w:t>
           </w:r>
           <w:r>
             <w:rPr>
@@ -176,7 +187,7 @@
           </w:r>
         </w:sdtContent>
       </w:sdt>
-      <w:hyperlink r:id="rId8">
+      <w:hyperlink r:id="rId7">
         <w:r>
           <w:rPr>
             <w:rFonts w:ascii="Times New Roman" w:eastAsia="Times New Roman" w:hAnsi="Times New Roman" w:cs="Times New Roman"/>
@@ -217,11 +228,11 @@
               <w:szCs w:val="28"/>
               <w:highlight w:val="white"/>
             </w:rPr>
-            <w:t>♦</w:t>
+            <w:t xml:space="preserve">♦ </w:t>
           </w:r>
         </w:sdtContent>
       </w:sdt>
-      <w:hyperlink r:id="rId9">
+      <w:hyperlink r:id="rId8">
         <w:r>
           <w:rPr>
             <w:rFonts w:ascii="Times New Roman" w:eastAsia="Times New Roman" w:hAnsi="Times New Roman" w:cs="Times New Roman"/>
@@ -452,17 +463,7 @@
           <w:sz w:val="20"/>
           <w:szCs w:val="20"/>
         </w:rPr>
-        <w:t xml:space="preserve">, </w:t>
-      </w:r>
-      <w:r>
-        <w:rPr>
-          <w:rFonts w:ascii="Times New Roman" w:hAnsi="Times New Roman" w:cs="Times New Roman"/>
-          <w:color w:val="000000" w:themeColor="text1"/>
-          <w:sz w:val="20"/>
-          <w:szCs w:val="20"/>
-          <w:shd w:val="clear" w:color="auto" w:fill="FFFFFF"/>
-        </w:rPr>
-        <w:t>Intro Artificial Intelligence.</w:t>
+        <w:t>.</w:t>
       </w:r>
     </w:p>
     <w:p>
@@ -1963,7 +1964,7 @@
         </w:rPr>
         <w:t xml:space="preserve">HTML, CSS, JavaScript, </w:t>
       </w:r>
-      <w:hyperlink r:id="rId10">
+      <w:hyperlink r:id="rId9">
         <w:r>
           <w:rPr>
             <w:rFonts w:ascii="Times New Roman" w:eastAsia="Times New Roman" w:hAnsi="Times New Roman" w:cs="Times New Roman"/>
@@ -1995,25 +1996,7 @@
           <w:sz w:val="20"/>
           <w:szCs w:val="20"/>
         </w:rPr>
-        <w:t xml:space="preserve">Heroku, </w:t>
-      </w:r>
-      <w:proofErr w:type="spellStart"/>
-      <w:r>
-        <w:rPr>
-          <w:rFonts w:ascii="Times New Roman" w:eastAsia="Times New Roman" w:hAnsi="Times New Roman" w:cs="Times New Roman"/>
-          <w:sz w:val="20"/>
-          <w:szCs w:val="20"/>
-        </w:rPr>
-        <w:t>Vercel</w:t>
-      </w:r>
-      <w:proofErr w:type="spellEnd"/>
-      <w:r>
-        <w:rPr>
-          <w:rFonts w:ascii="Times New Roman" w:eastAsia="Times New Roman" w:hAnsi="Times New Roman" w:cs="Times New Roman"/>
-          <w:sz w:val="20"/>
-          <w:szCs w:val="20"/>
-        </w:rPr>
-        <w:t xml:space="preserve">, Netlify, </w:t>
+        <w:t xml:space="preserve">Heroku, Vercel, Netlify, </w:t>
       </w:r>
       <w:r>
         <w:rPr>
@@ -2029,15 +2012,119 @@
           <w:sz w:val="20"/>
           <w:szCs w:val="20"/>
         </w:rPr>
-        <w:t xml:space="preserve">, Trello, Postman (API testing), </w:t>
-      </w:r>
-      <w:r>
-        <w:rPr>
-          <w:rFonts w:ascii="Times New Roman" w:eastAsia="Times New Roman" w:hAnsi="Times New Roman" w:cs="Times New Roman"/>
-          <w:sz w:val="20"/>
-          <w:szCs w:val="20"/>
-        </w:rPr>
-        <w:t xml:space="preserve">Cypress (Unit Testing Tool), </w:t>
+        <w:t xml:space="preserve">, Trello, Postman (API </w:t>
+      </w:r>
+      <w:r>
+        <w:rPr>
+          <w:rFonts w:ascii="Times New Roman" w:eastAsia="Times New Roman" w:hAnsi="Times New Roman" w:cs="Times New Roman"/>
+          <w:sz w:val="20"/>
+          <w:szCs w:val="20"/>
+        </w:rPr>
+        <w:t>T</w:t>
+      </w:r>
+      <w:r>
+        <w:rPr>
+          <w:rFonts w:ascii="Times New Roman" w:eastAsia="Times New Roman" w:hAnsi="Times New Roman" w:cs="Times New Roman"/>
+          <w:sz w:val="20"/>
+          <w:szCs w:val="20"/>
+        </w:rPr>
+        <w:t xml:space="preserve">esting), </w:t>
+      </w:r>
+      <w:r>
+        <w:rPr>
+          <w:rFonts w:ascii="Times New Roman" w:eastAsia="Times New Roman" w:hAnsi="Times New Roman" w:cs="Times New Roman"/>
+          <w:sz w:val="20"/>
+          <w:szCs w:val="20"/>
+        </w:rPr>
+        <w:t>Cypress (Unit Testing Tool</w:t>
+      </w:r>
+      <w:r>
+        <w:rPr>
+          <w:rFonts w:ascii="Times New Roman" w:eastAsia="Times New Roman" w:hAnsi="Times New Roman" w:cs="Times New Roman"/>
+          <w:sz w:val="20"/>
+          <w:szCs w:val="20"/>
+        </w:rPr>
+        <w:t>s</w:t>
+      </w:r>
+      <w:r>
+        <w:rPr>
+          <w:rFonts w:ascii="Times New Roman" w:eastAsia="Times New Roman" w:hAnsi="Times New Roman" w:cs="Times New Roman"/>
+          <w:sz w:val="20"/>
+          <w:szCs w:val="20"/>
+        </w:rPr>
+        <w:t xml:space="preserve">), </w:t>
+      </w:r>
+      <w:r>
+        <w:rPr>
+          <w:rFonts w:ascii="Times New Roman" w:eastAsia="Times New Roman" w:hAnsi="Times New Roman" w:cs="Times New Roman"/>
+          <w:sz w:val="20"/>
+          <w:szCs w:val="20"/>
+        </w:rPr>
+        <w:t>P</w:t>
+      </w:r>
+      <w:r>
+        <w:rPr>
+          <w:rFonts w:ascii="Times New Roman" w:eastAsia="Times New Roman" w:hAnsi="Times New Roman" w:cs="Times New Roman"/>
+          <w:sz w:val="20"/>
+          <w:szCs w:val="20"/>
+        </w:rPr>
+        <w:t xml:space="preserve">ytest </w:t>
+      </w:r>
+      <w:r>
+        <w:rPr>
+          <w:rFonts w:ascii="Times New Roman" w:eastAsia="Times New Roman" w:hAnsi="Times New Roman" w:cs="Times New Roman"/>
+          <w:sz w:val="20"/>
+          <w:szCs w:val="20"/>
+        </w:rPr>
+        <w:t>(U</w:t>
+      </w:r>
+      <w:r>
+        <w:rPr>
+          <w:rFonts w:ascii="Times New Roman" w:eastAsia="Times New Roman" w:hAnsi="Times New Roman" w:cs="Times New Roman"/>
+          <w:sz w:val="20"/>
+          <w:szCs w:val="20"/>
+        </w:rPr>
+        <w:t xml:space="preserve">nit </w:t>
+      </w:r>
+      <w:r>
+        <w:rPr>
+          <w:rFonts w:ascii="Times New Roman" w:eastAsia="Times New Roman" w:hAnsi="Times New Roman" w:cs="Times New Roman"/>
+          <w:sz w:val="20"/>
+          <w:szCs w:val="20"/>
+        </w:rPr>
+        <w:t>T</w:t>
+      </w:r>
+      <w:r>
+        <w:rPr>
+          <w:rFonts w:ascii="Times New Roman" w:eastAsia="Times New Roman" w:hAnsi="Times New Roman" w:cs="Times New Roman"/>
+          <w:sz w:val="20"/>
+          <w:szCs w:val="20"/>
+        </w:rPr>
+        <w:t>esting</w:t>
+      </w:r>
+      <w:r>
+        <w:rPr>
+          <w:rFonts w:ascii="Times New Roman" w:eastAsia="Times New Roman" w:hAnsi="Times New Roman" w:cs="Times New Roman"/>
+          <w:sz w:val="20"/>
+          <w:szCs w:val="20"/>
+        </w:rPr>
+        <w:t xml:space="preserve"> Tools</w:t>
+      </w:r>
+      <w:r>
+        <w:rPr>
+          <w:rFonts w:ascii="Times New Roman" w:eastAsia="Times New Roman" w:hAnsi="Times New Roman" w:cs="Times New Roman"/>
+          <w:sz w:val="20"/>
+          <w:szCs w:val="20"/>
+        </w:rPr>
+        <w:t>)</w:t>
+      </w:r>
+      <w:r>
+        <w:rPr>
+          <w:rFonts w:ascii="Times New Roman" w:eastAsia="Times New Roman" w:hAnsi="Times New Roman" w:cs="Times New Roman"/>
+          <w:sz w:val="20"/>
+          <w:szCs w:val="20"/>
+        </w:rPr>
+        <w:t xml:space="preserve">, Jest (Unit Testing Tools), </w:t>
       </w:r>
       <w:r>
         <w:rPr>
@@ -2067,7 +2154,7 @@
 </file>
 
 <file path=word/numbering.xml><?xml version="1.0" encoding="utf-8"?>
-<w:numbering xmlns:wpc="http://schemas.microsoft.com/office/word/2010/wordprocessingCanvas" xmlns:cx="http://schemas.microsoft.com/office/drawing/2014/chartex" xmlns:cx1="http://schemas.microsoft.com/office/drawing/2015/9/8/chartex" xmlns:cx2="http://schemas.microsoft.com/office/drawing/2015/10/21/chartex" xmlns:cx3="http://schemas.microsoft.com/office/drawing/2016/5/9/chartex" xmlns:cx4="http://schemas.microsoft.com/office/drawing/2016/5/10/chartex" xmlns:cx5="http://schemas.microsoft.com/office/drawing/2016/5/11/chartex" xmlns:cx6="http://schemas.microsoft.com/office/drawing/2016/5/12/chartex" xmlns:cx7="http://schemas.microsoft.com/office/drawing/2016/5/13/chartex" xmlns:cx8="http://schemas.microsoft.com/office/drawing/2016/5/14/chartex" xmlns:mc="http://schemas.openxmlformats.org/markup-compatibility/2006" xmlns:aink="http://schemas.microsoft.com/office/drawing/2016/ink" xmlns:am3d="http://schemas.microsoft.com/office/drawing/2017/model3d" xmlns:o="urn:schemas-microsoft-com:office:office" xmlns:oel="http://schemas.microsoft.com/office/2019/extlst" xmlns:r="http://schemas.openxmlformats.org/officeDocument/2006/relationships" xmlns:m="http://schemas.openxmlformats.org/officeDocument/2006/math" xmlns:v="urn:schemas-microsoft-com:vml" xmlns:wp14="http://schemas.microsoft.com/office/word/2010/wordprocessingDrawing" xmlns:wp="http://schemas.openxmlformats.org/drawingml/2006/wordprocessingDrawing" xmlns:w10="urn:schemas-microsoft-com:office:word" xmlns:w="http://schemas.openxmlformats.org/wordprocessingml/2006/main" xmlns:w14="http://schemas.microsoft.com/office/word/2010/wordml" xmlns:w15="http://schemas.microsoft.com/office/word/2012/wordml" xmlns:w16cex="http://schemas.microsoft.com/office/word/2018/wordml/cex" xmlns:w16cid="http://schemas.microsoft.com/office/word/2016/wordml/cid" xmlns:w16="http://schemas.microsoft.com/office/word/2018/wordml" xmlns:w16du="http://schemas.microsoft.com/office/word/2023/wordml/word16du" xmlns:w16sdtdh="http://schemas.microsoft.com/office/word/2020/wordml/sdtdatahash" xmlns:w16sdtfl="http://schemas.microsoft.com/office/word/2024/wordml/sdtformatlock" xmlns:w16se="http://schemas.microsoft.com/office/word/2015/wordml/symex" xmlns:wpg="http://schemas.microsoft.com/office/word/2010/wordprocessingGroup" xmlns:wpi="http://schemas.microsoft.com/office/word/2010/wordprocessingInk" xmlns:wne="http://schemas.microsoft.com/office/word/2006/wordml" xmlns:wps="http://schemas.microsoft.com/office/word/2010/wordprocessingShape" mc:Ignorable="w14 w15 w16se w16cid w16 w16cex w16sdtdh w16sdtfl w16du wp14">
+<w:numbering xmlns:wpc="http://schemas.microsoft.com/office/word/2010/wordprocessingCanvas" xmlns:cx="http://schemas.microsoft.com/office/drawing/2014/chartex" xmlns:cx1="http://schemas.microsoft.com/office/drawing/2015/9/8/chartex" xmlns:cx2="http://schemas.microsoft.com/office/drawing/2015/10/21/chartex" xmlns:cx3="http://schemas.microsoft.com/office/drawing/2016/5/9/chartex" xmlns:cx4="http://schemas.microsoft.com/office/drawing/2016/5/10/chartex" xmlns:cx5="http://schemas.microsoft.com/office/drawing/2016/5/11/chartex" xmlns:cx6="http://schemas.microsoft.com/office/drawing/2016/5/12/chartex" xmlns:cx7="http://schemas.microsoft.com/office/drawing/2016/5/13/chartex" xmlns:cx8="http://schemas.microsoft.com/office/drawing/2016/5/14/chartex" xmlns:mc="http://schemas.openxmlformats.org/markup-compatibility/2006" xmlns:m="http://schemas.openxmlformats.org/officeDocument/2006/math" xmlns:aink="http://schemas.microsoft.com/office/drawing/2016/ink" xmlns:am3d="http://schemas.microsoft.com/office/drawing/2017/model3d" xmlns:oel="http://schemas.microsoft.com/office/2019/extlst" xmlns:r="http://schemas.openxmlformats.org/officeDocument/2006/relationships" xmlns:wp14="http://schemas.microsoft.com/office/word/2010/wordprocessingDrawing" xmlns:wp="http://schemas.openxmlformats.org/drawingml/2006/wordprocessingDrawing" xmlns:wpg="http://schemas.microsoft.com/office/word/2010/wordprocessingGroup" xmlns:wpi="http://schemas.microsoft.com/office/word/2010/wordprocessingInk" xmlns:wps="http://schemas.microsoft.com/office/word/2010/wordprocessingShape" xmlns:o="urn:schemas-microsoft-com:office:office" xmlns:v="urn:schemas-microsoft-com:vml" xmlns:w10="urn:schemas-microsoft-com:office:word" xmlns:w="http://schemas.openxmlformats.org/wordprocessingml/2006/main" xmlns:w14="http://schemas.microsoft.com/office/word/2010/wordml" xmlns:w15="http://schemas.microsoft.com/office/word/2012/wordml" xmlns:w16cex="http://schemas.microsoft.com/office/word/2018/wordml/cex" xmlns:w16cid="http://schemas.microsoft.com/office/word/2016/wordml/cid" xmlns:w16="http://schemas.microsoft.com/office/word/2018/wordml" xmlns:w16sdtdh="http://schemas.microsoft.com/office/word/2020/wordml/sdtdatahash" xmlns:w16sdtfl="http://schemas.microsoft.com/office/word/2024/wordml/sdtformatlock" xmlns:w16se="http://schemas.microsoft.com/office/word/2015/wordml/symex" xmlns:w16du="http://schemas.microsoft.com/office/word/2023/wordml/word16du" xmlns:wne="http://schemas.microsoft.com/office/word/2006/wordml" mc:Ignorable="w14 w15 w16se w16cid w16 w16cex w16sdtdh w16sdtfl w16du wp14">
   <w:abstractNum w:abstractNumId="0" w15:restartNumberingAfterBreak="0">
     <w:nsid w:val="099B2C24"/>
     <w:multiLevelType w:val="hybridMultilevel"/>
@@ -2182,6 +2269,155 @@
     </w:lvl>
   </w:abstractNum>
   <w:abstractNum w:abstractNumId="1" w15:restartNumberingAfterBreak="0">
+    <w:nsid w:val="20146477"/>
+    <w:multiLevelType w:val="multilevel"/>
+    <w:tmpl w:val="C974ECEA"/>
+    <w:lvl w:ilvl="0">
+      <w:start w:val="1"/>
+      <w:numFmt w:val="bullet"/>
+      <w:lvlText w:val=""/>
+      <w:lvlJc w:val="left"/>
+      <w:pPr>
+        <w:tabs>
+          <w:tab w:val="num" w:pos="720"/>
+        </w:tabs>
+        <w:ind w:left="720" w:hanging="360"/>
+      </w:pPr>
+      <w:rPr>
+        <w:rFonts w:ascii="Symbol" w:hAnsi="Symbol" w:hint="default"/>
+        <w:sz w:val="20"/>
+      </w:rPr>
+    </w:lvl>
+    <w:lvl w:ilvl="1" w:tentative="1">
+      <w:start w:val="1"/>
+      <w:numFmt w:val="bullet"/>
+      <w:lvlText w:val="o"/>
+      <w:lvlJc w:val="left"/>
+      <w:pPr>
+        <w:tabs>
+          <w:tab w:val="num" w:pos="1440"/>
+        </w:tabs>
+        <w:ind w:left="1440" w:hanging="360"/>
+      </w:pPr>
+      <w:rPr>
+        <w:rFonts w:ascii="Courier New" w:hAnsi="Courier New" w:hint="default"/>
+        <w:sz w:val="20"/>
+      </w:rPr>
+    </w:lvl>
+    <w:lvl w:ilvl="2" w:tentative="1">
+      <w:start w:val="1"/>
+      <w:numFmt w:val="bullet"/>
+      <w:lvlText w:val=""/>
+      <w:lvlJc w:val="left"/>
+      <w:pPr>
+        <w:tabs>
+          <w:tab w:val="num" w:pos="2160"/>
+        </w:tabs>
+        <w:ind w:left="2160" w:hanging="360"/>
+      </w:pPr>
+      <w:rPr>
+        <w:rFonts w:ascii="Wingdings" w:hAnsi="Wingdings" w:hint="default"/>
+        <w:sz w:val="20"/>
+      </w:rPr>
+    </w:lvl>
+    <w:lvl w:ilvl="3" w:tentative="1">
+      <w:start w:val="1"/>
+      <w:numFmt w:val="bullet"/>
+      <w:lvlText w:val=""/>
+      <w:lvlJc w:val="left"/>
+      <w:pPr>
+        <w:tabs>
+          <w:tab w:val="num" w:pos="2880"/>
+        </w:tabs>
+        <w:ind w:left="2880" w:hanging="360"/>
+      </w:pPr>
+      <w:rPr>
+        <w:rFonts w:ascii="Wingdings" w:hAnsi="Wingdings" w:hint="default"/>
+        <w:sz w:val="20"/>
+      </w:rPr>
+    </w:lvl>
+    <w:lvl w:ilvl="4" w:tentative="1">
+      <w:start w:val="1"/>
+      <w:numFmt w:val="bullet"/>
+      <w:lvlText w:val=""/>
+      <w:lvlJc w:val="left"/>
+      <w:pPr>
+        <w:tabs>
+          <w:tab w:val="num" w:pos="3600"/>
+        </w:tabs>
+        <w:ind w:left="3600" w:hanging="360"/>
+      </w:pPr>
+      <w:rPr>
+        <w:rFonts w:ascii="Wingdings" w:hAnsi="Wingdings" w:hint="default"/>
+        <w:sz w:val="20"/>
+      </w:rPr>
+    </w:lvl>
+    <w:lvl w:ilvl="5" w:tentative="1">
+      <w:start w:val="1"/>
+      <w:numFmt w:val="bullet"/>
+      <w:lvlText w:val=""/>
+      <w:lvlJc w:val="left"/>
+      <w:pPr>
+        <w:tabs>
+          <w:tab w:val="num" w:pos="4320"/>
+        </w:tabs>
+        <w:ind w:left="4320" w:hanging="360"/>
+      </w:pPr>
+      <w:rPr>
+        <w:rFonts w:ascii="Wingdings" w:hAnsi="Wingdings" w:hint="default"/>
+        <w:sz w:val="20"/>
+      </w:rPr>
+    </w:lvl>
+    <w:lvl w:ilvl="6" w:tentative="1">
+      <w:start w:val="1"/>
+      <w:numFmt w:val="bullet"/>
+      <w:lvlText w:val=""/>
+      <w:lvlJc w:val="left"/>
+      <w:pPr>
+        <w:tabs>
+          <w:tab w:val="num" w:pos="5040"/>
+        </w:tabs>
+        <w:ind w:left="5040" w:hanging="360"/>
+      </w:pPr>
+      <w:rPr>
+        <w:rFonts w:ascii="Wingdings" w:hAnsi="Wingdings" w:hint="default"/>
+        <w:sz w:val="20"/>
+      </w:rPr>
+    </w:lvl>
+    <w:lvl w:ilvl="7" w:tentative="1">
+      <w:start w:val="1"/>
+      <w:numFmt w:val="bullet"/>
+      <w:lvlText w:val=""/>
+      <w:lvlJc w:val="left"/>
+      <w:pPr>
+        <w:tabs>
+          <w:tab w:val="num" w:pos="5760"/>
+        </w:tabs>
+        <w:ind w:left="5760" w:hanging="360"/>
+      </w:pPr>
+      <w:rPr>
+        <w:rFonts w:ascii="Wingdings" w:hAnsi="Wingdings" w:hint="default"/>
+        <w:sz w:val="20"/>
+      </w:rPr>
+    </w:lvl>
+    <w:lvl w:ilvl="8" w:tentative="1">
+      <w:start w:val="1"/>
+      <w:numFmt w:val="bullet"/>
+      <w:lvlText w:val=""/>
+      <w:lvlJc w:val="left"/>
+      <w:pPr>
+        <w:tabs>
+          <w:tab w:val="num" w:pos="6480"/>
+        </w:tabs>
+        <w:ind w:left="6480" w:hanging="360"/>
+      </w:pPr>
+      <w:rPr>
+        <w:rFonts w:ascii="Wingdings" w:hAnsi="Wingdings" w:hint="default"/>
+        <w:sz w:val="20"/>
+      </w:rPr>
+    </w:lvl>
+  </w:abstractNum>
+  <w:abstractNum w:abstractNumId="2" w15:restartNumberingAfterBreak="0">
     <w:nsid w:val="211A14BC"/>
     <w:multiLevelType w:val="multilevel"/>
     <w:tmpl w:val="2DEADB20"/>
@@ -2294,7 +2530,7 @@
       </w:rPr>
     </w:lvl>
   </w:abstractNum>
-  <w:abstractNum w:abstractNumId="2" w15:restartNumberingAfterBreak="0">
+  <w:abstractNum w:abstractNumId="3" w15:restartNumberingAfterBreak="0">
     <w:nsid w:val="21F43BA6"/>
     <w:multiLevelType w:val="multilevel"/>
     <w:tmpl w:val="FB4E9ADE"/>
@@ -2407,7 +2643,7 @@
       </w:rPr>
     </w:lvl>
   </w:abstractNum>
-  <w:abstractNum w:abstractNumId="3" w15:restartNumberingAfterBreak="0">
+  <w:abstractNum w:abstractNumId="4" w15:restartNumberingAfterBreak="0">
     <w:nsid w:val="23693564"/>
     <w:multiLevelType w:val="hybridMultilevel"/>
     <w:tmpl w:val="FB0ECF14"/>
@@ -2520,7 +2756,7 @@
       </w:rPr>
     </w:lvl>
   </w:abstractNum>
-  <w:abstractNum w:abstractNumId="4" w15:restartNumberingAfterBreak="0">
+  <w:abstractNum w:abstractNumId="5" w15:restartNumberingAfterBreak="0">
     <w:nsid w:val="2CA32059"/>
     <w:multiLevelType w:val="hybridMultilevel"/>
     <w:tmpl w:val="47840AB4"/>
@@ -2633,7 +2869,7 @@
       </w:rPr>
     </w:lvl>
   </w:abstractNum>
-  <w:abstractNum w:abstractNumId="5" w15:restartNumberingAfterBreak="0">
+  <w:abstractNum w:abstractNumId="6" w15:restartNumberingAfterBreak="0">
     <w:nsid w:val="3C747A65"/>
     <w:multiLevelType w:val="multilevel"/>
     <w:tmpl w:val="7BA8575C"/>
@@ -2764,7 +3000,7 @@
       </w:rPr>
     </w:lvl>
   </w:abstractNum>
-  <w:abstractNum w:abstractNumId="6" w15:restartNumberingAfterBreak="0">
+  <w:abstractNum w:abstractNumId="7" w15:restartNumberingAfterBreak="0">
     <w:nsid w:val="454E7C3D"/>
     <w:multiLevelType w:val="multilevel"/>
     <w:tmpl w:val="EC622AE4"/>
@@ -2877,7 +3113,7 @@
       </w:rPr>
     </w:lvl>
   </w:abstractNum>
-  <w:abstractNum w:abstractNumId="7" w15:restartNumberingAfterBreak="0">
+  <w:abstractNum w:abstractNumId="8" w15:restartNumberingAfterBreak="0">
     <w:nsid w:val="4573138E"/>
     <w:multiLevelType w:val="multilevel"/>
     <w:tmpl w:val="9F7E17F8"/>
@@ -3008,7 +3244,7 @@
       </w:rPr>
     </w:lvl>
   </w:abstractNum>
-  <w:abstractNum w:abstractNumId="8" w15:restartNumberingAfterBreak="0">
+  <w:abstractNum w:abstractNumId="9" w15:restartNumberingAfterBreak="0">
     <w:nsid w:val="5017480D"/>
     <w:multiLevelType w:val="hybridMultilevel"/>
     <w:tmpl w:val="B6289EDA"/>
@@ -3121,7 +3357,7 @@
       </w:rPr>
     </w:lvl>
   </w:abstractNum>
-  <w:abstractNum w:abstractNumId="9" w15:restartNumberingAfterBreak="0">
+  <w:abstractNum w:abstractNumId="10" w15:restartNumberingAfterBreak="0">
     <w:nsid w:val="51E75C98"/>
     <w:multiLevelType w:val="multilevel"/>
     <w:tmpl w:val="F5BCE2F4"/>
@@ -3234,7 +3470,7 @@
       </w:rPr>
     </w:lvl>
   </w:abstractNum>
-  <w:abstractNum w:abstractNumId="10" w15:restartNumberingAfterBreak="0">
+  <w:abstractNum w:abstractNumId="11" w15:restartNumberingAfterBreak="0">
     <w:nsid w:val="5CEE5DAD"/>
     <w:multiLevelType w:val="multilevel"/>
     <w:tmpl w:val="05E2328E"/>
@@ -3347,7 +3583,7 @@
       </w:rPr>
     </w:lvl>
   </w:abstractNum>
-  <w:abstractNum w:abstractNumId="11" w15:restartNumberingAfterBreak="0">
+  <w:abstractNum w:abstractNumId="12" w15:restartNumberingAfterBreak="0">
     <w:nsid w:val="71690735"/>
     <w:multiLevelType w:val="hybridMultilevel"/>
     <w:tmpl w:val="FB802844"/>
@@ -3460,7 +3696,7 @@
       </w:rPr>
     </w:lvl>
   </w:abstractNum>
-  <w:abstractNum w:abstractNumId="12" w15:restartNumberingAfterBreak="0">
+  <w:abstractNum w:abstractNumId="13" w15:restartNumberingAfterBreak="0">
     <w:nsid w:val="79046D99"/>
     <w:multiLevelType w:val="multilevel"/>
     <w:tmpl w:val="B3AA0634"/>
@@ -3592,7 +3828,7 @@
       </w:rPr>
     </w:lvl>
   </w:abstractNum>
-  <w:abstractNum w:abstractNumId="13" w15:restartNumberingAfterBreak="0">
+  <w:abstractNum w:abstractNumId="14" w15:restartNumberingAfterBreak="0">
     <w:nsid w:val="79B1448B"/>
     <w:multiLevelType w:val="multilevel"/>
     <w:tmpl w:val="CFD6F78A"/>
@@ -3707,52 +3943,55 @@
     </w:lvl>
   </w:abstractNum>
   <w:num w:numId="1" w16cid:durableId="785655957">
-    <w:abstractNumId w:val="1"/>
+    <w:abstractNumId w:val="2"/>
   </w:num>
   <w:num w:numId="2" w16cid:durableId="2010598813">
+    <w:abstractNumId w:val="14"/>
+  </w:num>
+  <w:num w:numId="3" w16cid:durableId="1856768988">
+    <w:abstractNumId w:val="3"/>
+  </w:num>
+  <w:num w:numId="4" w16cid:durableId="1775586629">
+    <w:abstractNumId w:val="7"/>
+  </w:num>
+  <w:num w:numId="5" w16cid:durableId="1445266502">
+    <w:abstractNumId w:val="10"/>
+  </w:num>
+  <w:num w:numId="6" w16cid:durableId="1040202924">
     <w:abstractNumId w:val="13"/>
   </w:num>
-  <w:num w:numId="3" w16cid:durableId="1856768988">
-    <w:abstractNumId w:val="2"/>
-  </w:num>
-  <w:num w:numId="4" w16cid:durableId="1775586629">
+  <w:num w:numId="7" w16cid:durableId="771556865">
     <w:abstractNumId w:val="6"/>
   </w:num>
-  <w:num w:numId="5" w16cid:durableId="1445266502">
-    <w:abstractNumId w:val="9"/>
+  <w:num w:numId="8" w16cid:durableId="824971950">
+    <w:abstractNumId w:val="8"/>
   </w:num>
-  <w:num w:numId="6" w16cid:durableId="1040202924">
+  <w:num w:numId="9" w16cid:durableId="2071728837">
+    <w:abstractNumId w:val="11"/>
+  </w:num>
+  <w:num w:numId="10" w16cid:durableId="904032132">
     <w:abstractNumId w:val="12"/>
   </w:num>
-  <w:num w:numId="7" w16cid:durableId="771556865">
-    <w:abstractNumId w:val="5"/>
-  </w:num>
-  <w:num w:numId="8" w16cid:durableId="824971950">
-    <w:abstractNumId w:val="7"/>
-  </w:num>
-  <w:num w:numId="9" w16cid:durableId="2071728837">
-    <w:abstractNumId w:val="10"/>
-  </w:num>
-  <w:num w:numId="10" w16cid:durableId="904032132">
-    <w:abstractNumId w:val="11"/>
-  </w:num>
   <w:num w:numId="11" w16cid:durableId="1262760421">
-    <w:abstractNumId w:val="8"/>
+    <w:abstractNumId w:val="9"/>
   </w:num>
   <w:num w:numId="12" w16cid:durableId="1657606811">
     <w:abstractNumId w:val="0"/>
   </w:num>
   <w:num w:numId="13" w16cid:durableId="1582838194">
+    <w:abstractNumId w:val="5"/>
+  </w:num>
+  <w:num w:numId="14" w16cid:durableId="1007094624">
     <w:abstractNumId w:val="4"/>
   </w:num>
-  <w:num w:numId="14" w16cid:durableId="1007094624">
-    <w:abstractNumId w:val="3"/>
+  <w:num w:numId="15" w16cid:durableId="800538466">
+    <w:abstractNumId w:val="1"/>
   </w:num>
 </w:numbering>
 </file>
 
 <file path=word/styles.xml><?xml version="1.0" encoding="utf-8"?>
-<w:styles xmlns:mc="http://schemas.openxmlformats.org/markup-compatibility/2006" xmlns:r="http://schemas.openxmlformats.org/officeDocument/2006/relationships" xmlns:w="http://schemas.openxmlformats.org/wordprocessingml/2006/main" xmlns:w14="http://schemas.microsoft.com/office/word/2010/wordml" xmlns:w15="http://schemas.microsoft.com/office/word/2012/wordml" xmlns:w16cex="http://schemas.microsoft.com/office/word/2018/wordml/cex" xmlns:w16cid="http://schemas.microsoft.com/office/word/2016/wordml/cid" xmlns:w16="http://schemas.microsoft.com/office/word/2018/wordml" xmlns:w16du="http://schemas.microsoft.com/office/word/2023/wordml/word16du" xmlns:w16sdtdh="http://schemas.microsoft.com/office/word/2020/wordml/sdtdatahash" xmlns:w16sdtfl="http://schemas.microsoft.com/office/word/2024/wordml/sdtformatlock" xmlns:w16se="http://schemas.microsoft.com/office/word/2015/wordml/symex" mc:Ignorable="w14 w15 w16se w16cid w16 w16cex w16sdtdh w16sdtfl w16du">
+<w:styles xmlns:mc="http://schemas.openxmlformats.org/markup-compatibility/2006" xmlns:r="http://schemas.openxmlformats.org/officeDocument/2006/relationships" xmlns:w="http://schemas.openxmlformats.org/wordprocessingml/2006/main" xmlns:w14="http://schemas.microsoft.com/office/word/2010/wordml" xmlns:w15="http://schemas.microsoft.com/office/word/2012/wordml" xmlns:w16cex="http://schemas.microsoft.com/office/word/2018/wordml/cex" xmlns:w16cid="http://schemas.microsoft.com/office/word/2016/wordml/cid" xmlns:w16="http://schemas.microsoft.com/office/word/2018/wordml" xmlns:w16sdtdh="http://schemas.microsoft.com/office/word/2020/wordml/sdtdatahash" xmlns:w16sdtfl="http://schemas.microsoft.com/office/word/2024/wordml/sdtformatlock" xmlns:w16se="http://schemas.microsoft.com/office/word/2015/wordml/symex" xmlns:w16du="http://schemas.microsoft.com/office/word/2023/wordml/word16du" mc:Ignorable="w14 w15 w16se w16cid w16 w16cex w16sdtdh w16sdtfl w16du">
   <w:docDefaults>
     <w:rPrDefault>
       <w:rPr>
@@ -4785,6 +5024,18 @@
       <w:u w:val="single"/>
     </w:rPr>
   </w:style>
+  <w:style w:type="paragraph" w:customStyle="1" w:styleId="vcard-detail">
+    <w:name w:val="vcard-detail"/>
+    <w:basedOn w:val="Normal"/>
+    <w:rsid w:val="00B346B6"/>
+    <w:pPr>
+      <w:spacing w:before="100" w:beforeAutospacing="1" w:after="100" w:afterAutospacing="1" w:line="240" w:lineRule="auto"/>
+    </w:pPr>
+    <w:rPr>
+      <w:rFonts w:ascii="Times New Roman" w:eastAsia="Times New Roman" w:hAnsi="Times New Roman" w:cs="Times New Roman"/>
+      <w:lang w:val="en-US"/>
+    </w:rPr>
+  </w:style>
 </w:styles>
 </file>
 

</xml_diff>